<commit_message>
Final manuscript submission: Updated figures (Normal=1.76), tables, legends, and fixed all absolute paths
</commit_message>
<xml_diff>
--- a/diabetes_extension/results/Supplementary_Figure_Legends.docx
+++ b/diabetes_extension/results/Supplementary_Figure_Legends.docx
@@ -4,6 +4,7 @@
   <w:body>
     <w:p>
       <w:pPr>
+        <w:jc w:val="both"/>
         <w:rPr>
           <w:rtl/>
         </w:rPr>
@@ -101,6 +102,17 @@
     </w:p>
     <w:p>
       <w:pPr>
+        <w:jc w:val="both"/>
+        <w:rPr>
+          <w:rtl/>
+        </w:rPr>
+      </w:pPr>
+      <w:bookmarkStart w:id="0" w:name="_GoBack"/>
+      <w:bookmarkEnd w:id="0"/>
+    </w:p>
+    <w:p>
+      <w:pPr>
+        <w:jc w:val="both"/>
         <w:rPr>
           <w:rtl/>
         </w:rPr>
@@ -108,12 +120,8 @@
     </w:p>
     <w:p>
       <w:pPr>
-        <w:rPr>
-          <w:rtl/>
-        </w:rPr>
+        <w:jc w:val="both"/>
       </w:pPr>
-    </w:p>
-    <w:p>
       <w:r>
         <w:rPr>
           <w:b/>
@@ -155,10 +163,35 @@
       </w:r>
       <w:proofErr w:type="spellEnd"/>
       <w:r>
-        <w:t xml:space="preserve"> correction where applicable). In normal beta cells, target genes show significantly higher expression than controls (fold change = 1.53, * p = 0.039). In T1D, this expression advantage is lost (fold change = 1.11, NS). In T2D, expression is reduced (fold change = 0.84, NS, but directionally reversed). For methylation, no significant change is observed in T1D (fold change ≈ 1.0, NS), whereas a significant reduction is seen in T2D (fold change ≈ 0.53, ** p = 0.0034). Error bars represent standard error of the mean (SEM) for methylation data. Abbreviations: T1D, type 1 diabetes; T2D, type 2 diabetes; NS, not significant.</w:t>
-      </w:r>
-      <w:bookmarkStart w:id="0" w:name="_GoBack"/>
-      <w:bookmarkEnd w:id="0"/>
+        <w:t xml:space="preserve"> correction where applicable). In normal beta cells, target genes show significantly higher expression than controls (fold change </w:t>
+      </w:r>
+      <w:r>
+        <w:rPr>
+          <w:i/>
+          <w:iCs/>
+        </w:rPr>
+        <w:t>= </w:t>
+      </w:r>
+      <w:r>
+        <w:t xml:space="preserve">1.76, ** p = 0.00118; </w:t>
+      </w:r>
+      <w:proofErr w:type="spellStart"/>
+      <w:r>
+        <w:t>Bonferroni</w:t>
+      </w:r>
+      <w:proofErr w:type="spellEnd"/>
+      <w:r>
+        <w:t>-adjusted p = 0.00354</w:t>
+      </w:r>
+      <w:r>
+        <w:t>)</w:t>
+      </w:r>
+      <w:r>
+        <w:t>.</w:t>
+      </w:r>
+      <w:r>
+        <w:t xml:space="preserve"> In T1D, this expression advantage is lost (fold change = 1.11, NS). In T2D, expression is reduced (fold change = 0.84, NS, but directionally reversed). For methylation, no significant change is observed in T1D (fold change ≈ 1.0, NS), whereas a significant reduction is seen in T2D (fold change ≈ 0.53, ** p = 0.0034). Error bars represent standard error of the mean (SEM) for methylation data. Abbreviations: T1D, type 1 diabetes; T2D, type 2 diabetes; NS, not significant.</w:t>
+      </w:r>
     </w:p>
     <w:sectPr>
       <w:pgSz w:w="12240" w:h="15840"/>
@@ -567,6 +600,7 @@
   <w:style w:type="character" w:default="1" w:styleId="DefaultParagraphFont">
     <w:name w:val="Default Paragraph Font"/>
     <w:uiPriority w:val="1"/>
+    <w:semiHidden/>
     <w:unhideWhenUsed/>
   </w:style>
   <w:style w:type="table" w:default="1" w:styleId="TableNormal">

</xml_diff>